<commit_message>
Added traffic simulation scenarios
</commit_message>
<xml_diff>
--- a/Reports/Git_Repository_Template.docx
+++ b/Reports/Git_Repository_Template.docx
@@ -76,7 +76,23 @@
                 <w:rFonts w:asciiTheme="majorHAnsi" w:hAnsiTheme="majorHAnsi" w:cstheme="majorHAnsi"/>
                 <w:szCs w:val="21"/>
               </w:rPr>
-              <w:t>. Update it every two weeks and do not remove earlier records. Use it to summarise sustained implementation and development work evidenced through your Git repository or equivalent version-controlled development record.</w:t>
+              <w:t xml:space="preserve">. Update it every two weeks and do not remove earlier records. Use it to </w:t>
+            </w:r>
+            <w:proofErr w:type="spellStart"/>
+            <w:r>
+              <w:rPr>
+                <w:rFonts w:asciiTheme="majorHAnsi" w:hAnsiTheme="majorHAnsi" w:cstheme="majorHAnsi"/>
+                <w:szCs w:val="21"/>
+              </w:rPr>
+              <w:t>summarise</w:t>
+            </w:r>
+            <w:proofErr w:type="spellEnd"/>
+            <w:r>
+              <w:rPr>
+                <w:rFonts w:asciiTheme="majorHAnsi" w:hAnsiTheme="majorHAnsi" w:cstheme="majorHAnsi"/>
+                <w:szCs w:val="21"/>
+              </w:rPr>
+              <w:t xml:space="preserve"> sustained implementation and development work evidenced through your Git repository or equivalent version-controlled development record.</w:t>
             </w:r>
             <w:r>
               <w:rPr>
@@ -93,7 +109,29 @@
                 <w:bCs w:val="0"/>
                 <w:szCs w:val="21"/>
               </w:rPr>
-              <w:t xml:space="preserve">Each entry should summarise the development work completed, the principal files or components affected, and the key evidence of progress. Where applicable, relevant screenshots of the Git commit history should also </w:t>
+              <w:t xml:space="preserve">Each entry should </w:t>
+            </w:r>
+            <w:proofErr w:type="spellStart"/>
+            <w:r>
+              <w:rPr>
+                <w:rStyle w:val="Strong"/>
+                <w:rFonts w:asciiTheme="majorHAnsi" w:hAnsiTheme="majorHAnsi" w:cstheme="majorHAnsi"/>
+                <w:b w:val="0"/>
+                <w:bCs w:val="0"/>
+                <w:szCs w:val="21"/>
+              </w:rPr>
+              <w:t>summarise</w:t>
+            </w:r>
+            <w:proofErr w:type="spellEnd"/>
+            <w:r>
+              <w:rPr>
+                <w:rStyle w:val="Strong"/>
+                <w:rFonts w:asciiTheme="majorHAnsi" w:hAnsiTheme="majorHAnsi" w:cstheme="majorHAnsi"/>
+                <w:b w:val="0"/>
+                <w:bCs w:val="0"/>
+                <w:szCs w:val="21"/>
+              </w:rPr>
+              <w:t xml:space="preserve"> the development work completed, the principal files or components affected, and the key evidence of progress. Where applicable, relevant screenshots of the Git commit history should also </w:t>
             </w:r>
             <w:r>
               <w:rPr>
@@ -619,8 +657,17 @@
                 <w:rFonts w:asciiTheme="majorHAnsi" w:hAnsiTheme="majorHAnsi" w:cstheme="majorHAnsi"/>
                 <w:sz w:val="22"/>
               </w:rPr>
-              <w:t xml:space="preserve"> simulation.sumocfg</w:t>
+              <w:t xml:space="preserve"> </w:t>
             </w:r>
+            <w:proofErr w:type="spellStart"/>
+            <w:r>
+              <w:rPr>
+                <w:rFonts w:asciiTheme="majorHAnsi" w:hAnsiTheme="majorHAnsi" w:cstheme="majorHAnsi"/>
+                <w:sz w:val="22"/>
+              </w:rPr>
+              <w:t>simulation.sumocfg</w:t>
+            </w:r>
+            <w:proofErr w:type="spellEnd"/>
           </w:p>
         </w:tc>
       </w:tr>
@@ -690,11 +737,15 @@
               </w:rPr>
             </w:pPr>
             <w:r>
-              <w:rPr>
-                <w:rFonts w:asciiTheme="majorHAnsi" w:hAnsiTheme="majorHAnsi" w:cstheme="majorHAnsi"/>
-                <w:sz w:val="22"/>
-              </w:rPr>
-              <w:t>Enter a short summary of commit activity here. Add commit-history screenshots if applicable.</w:t>
+              <w:t>git commit -m "Initial project setup"</w:t>
+            </w:r>
+            <w:r>
+              <w:br/>
+              <w:t>git commit -m "Added SUMO network configuration"</w:t>
+            </w:r>
+            <w:r>
+              <w:br/>
+              <w:t>git commit -m "Added traffic simulation scenarios"</w:t>
             </w:r>
           </w:p>
         </w:tc>
@@ -986,7 +1037,23 @@
                 <w:rFonts w:asciiTheme="majorHAnsi" w:hAnsiTheme="majorHAnsi" w:cstheme="majorHAnsi"/>
                 <w:sz w:val="22"/>
               </w:rPr>
-              <w:t>Integrate SUMO with Python using TraCI and begin traffic data collection.</w:t>
+              <w:t xml:space="preserve">Integrate SUMO with Python using </w:t>
+            </w:r>
+            <w:proofErr w:type="spellStart"/>
+            <w:r>
+              <w:rPr>
+                <w:rFonts w:asciiTheme="majorHAnsi" w:hAnsiTheme="majorHAnsi" w:cstheme="majorHAnsi"/>
+                <w:sz w:val="22"/>
+              </w:rPr>
+              <w:t>TraCI</w:t>
+            </w:r>
+            <w:proofErr w:type="spellEnd"/>
+            <w:r>
+              <w:rPr>
+                <w:rFonts w:asciiTheme="majorHAnsi" w:hAnsiTheme="majorHAnsi" w:cstheme="majorHAnsi"/>
+                <w:sz w:val="22"/>
+              </w:rPr>
+              <w:t xml:space="preserve"> and begin traffic data collection.</w:t>
             </w:r>
           </w:p>
         </w:tc>
@@ -3940,6 +4007,7 @@
   <w:style w:type="character" w:default="1" w:styleId="DefaultParagraphFont">
     <w:name w:val="Default Paragraph Font"/>
     <w:uiPriority w:val="1"/>
+    <w:semiHidden/>
     <w:unhideWhenUsed/>
   </w:style>
   <w:style w:type="table" w:default="1" w:styleId="TableNormal">

</xml_diff>